<commit_message>
calendario y quitar 90 dias
</commit_message>
<xml_diff>
--- a/app/templates/cotizacion_template.docx
+++ b/app/templates/cotizacion_template.docx
@@ -1972,7 +1972,12 @@
         </w:rPr>
       </w:pPr>
       <w:r>
-        <w:rPr/>
+        <w:rPr>
+          <w:rFonts w:eastAsia="Times New Roman" w:cs="Calibri" w:cstheme="minorHAnsi"/>
+          <w:sz w:val="20"/>
+          <w:szCs w:val="20"/>
+          <w:lang w:val="es-ES_tradnl" w:eastAsia="es-ES"/>
+        </w:rPr>
       </w:r>
     </w:p>
     <w:p>
@@ -1988,7 +1993,12 @@
         </w:rPr>
       </w:pPr>
       <w:r>
-        <w:rPr/>
+        <w:rPr>
+          <w:rFonts w:eastAsia="Times New Roman" w:cs="Calibri" w:cstheme="minorHAnsi"/>
+          <w:sz w:val="20"/>
+          <w:szCs w:val="20"/>
+          <w:lang w:val="es-ES_tradnl" w:eastAsia="es-ES"/>
+        </w:rPr>
       </w:r>
     </w:p>
     <w:p>
@@ -4508,7 +4518,16 @@
           <w:szCs w:val="20"/>
           <w:lang w:val="es-AR" w:eastAsia="es-ES"/>
         </w:rPr>
-        <w:t xml:space="preserve">Dentro de un plazo de 90 días después del envío del Informe de Inspección de la ETAPA 2, se realizará una segunda inspección para verificar que se hayan levantado los </w:t>
+        <w:t>S</w:t>
+      </w:r>
+      <w:r>
+        <w:rPr>
+          <w:rFonts w:eastAsia="Times New Roman" w:cs="Calibri" w:cstheme="minorHAnsi"/>
+          <w:sz w:val="20"/>
+          <w:szCs w:val="20"/>
+          <w:lang w:val="es-AR" w:eastAsia="es-ES"/>
+        </w:rPr>
+        <w:t xml:space="preserve">e realizará una segunda inspección para verificar que se hayan levantado los </w:t>
       </w:r>
       <w:r>
         <w:rPr>
@@ -6517,7 +6536,14 @@
         </w:rPr>
       </w:pPr>
       <w:r>
-        <w:rPr/>
+        <w:rPr>
+          <w:rFonts w:eastAsia="Times New Roman" w:cs="Calibri" w:cstheme="minorHAnsi"/>
+          <w:b/>
+          <w:bCs/>
+          <w:sz w:val="20"/>
+          <w:szCs w:val="20"/>
+          <w:lang w:val="es-AR" w:eastAsia="es-ES"/>
+        </w:rPr>
       </w:r>
     </w:p>
     <w:p>
@@ -13396,9 +13422,9 @@
           <wp:wrapThrough wrapText="bothSides">
             <wp:wrapPolygon edited="0">
               <wp:start x="-21" y="0"/>
-              <wp:lineTo x="-21" y="20580"/>
-              <wp:lineTo x="21318" y="20580"/>
-              <wp:lineTo x="21318" y="0"/>
+              <wp:lineTo x="-21" y="20510"/>
+              <wp:lineTo x="21296" y="20510"/>
+              <wp:lineTo x="21296" y="0"/>
               <wp:lineTo x="-21" y="0"/>
             </wp:wrapPolygon>
           </wp:wrapThrough>

</xml_diff>

<commit_message>
multiples ascensores en una misma cotizacion
</commit_message>
<xml_diff>
--- a/app/templates/cotizacion_template.docx
+++ b/app/templates/cotizacion_template.docx
@@ -1087,6 +1087,7 @@
       <w:tr>
         <w:trPr>
           <w:trHeight w:val="322" w:hRule="atLeast"/>
+          <w:cantSplit w:val="true"/>
         </w:trPr>
         <w:tc>
           <w:tcPr>
@@ -1103,6 +1104,7 @@
           <w:p>
             <w:pPr>
               <w:pStyle w:val="Normal"/>
+              <w:keepNext w:val="true"/>
               <w:widowControl w:val="false"/>
               <w:spacing w:before="0" w:after="0"/>
               <w:jc w:val="center"/>
@@ -1211,6 +1213,7 @@
       <w:tr>
         <w:trPr>
           <w:trHeight w:val="744" w:hRule="atLeast"/>
+          <w:cantSplit w:val="true"/>
         </w:trPr>
         <w:tc>
           <w:tcPr>
@@ -13123,9 +13126,9 @@
           <wp:wrapThrough wrapText="bothSides">
             <wp:wrapPolygon edited="0">
               <wp:start x="-21" y="0"/>
-              <wp:lineTo x="-21" y="20225"/>
-              <wp:lineTo x="21210" y="20225"/>
-              <wp:lineTo x="21210" y="0"/>
+              <wp:lineTo x="-21" y="20082"/>
+              <wp:lineTo x="21167" y="20082"/>
+              <wp:lineTo x="21167" y="0"/>
               <wp:lineTo x="-21" y="0"/>
             </wp:wrapPolygon>
           </wp:wrapThrough>

</xml_diff>